<commit_message>
Publish CHIATECH Journal Issue 2 papers e026-e058 and rebuild e001-e025 publication assets
</commit_message>
<xml_diff>
--- a/papers/2026_V1I1_PIONEER_JULY_AUGUST_PART2/e026/manuscript/CHIATECH_JOURNAL_2026_V1I1_e026_PIONEER_PART2.docx
+++ b/papers/2026_V1I1_PIONEER_JULY_AUGUST_PART2/e026/manuscript/CHIATECH_JOURNAL_2026_V1I1_e026_PIONEER_PART2.docx
@@ -30,7 +30,6 @@
     <w:p>
       <w:pPr>
         <w:pStyle w:val="Subtitle"/>
-        <w:spacing w:after="100"/>
         <w:jc w:val="center"/>
       </w:pPr>
       <w:r>
@@ -495,6 +494,7 @@
         <w:pStyle w:val="Heading1"/>
       </w:pPr>
       <w:r>
+        <w:lastRenderedPageBreak/>
         <w:t>2. Review Approach</w:t>
       </w:r>
     </w:p>
@@ -513,7 +513,6 @@
         <w:rPr>
           <w:noProof/>
         </w:rPr>
-        <w:lastRenderedPageBreak/>
         <w:drawing>
           <wp:inline distT="0" distB="0" distL="0" distR="0" wp14:anchorId="0B1537CD" wp14:editId="480A6526">
             <wp:extent cx="5623560" cy="1533028"/>
@@ -556,12 +555,10 @@
         <w:pStyle w:val="Caption"/>
         <w:keepNext/>
         <w:spacing w:before="20" w:after="60"/>
-        <w:jc w:val="center"/>
       </w:pPr>
       <w:r>
         <w:rPr>
           <w:rFonts w:ascii="Aptos" w:hAnsi="Aptos"/>
-          <w:i/>
           <w:color w:val="6B7280"/>
           <w:sz w:val="15"/>
         </w:rPr>
@@ -614,12 +611,10 @@
         <w:pStyle w:val="Caption"/>
         <w:keepNext/>
         <w:spacing w:before="20" w:after="60"/>
-        <w:jc w:val="center"/>
       </w:pPr>
       <w:r>
         <w:rPr>
           <w:rFonts w:ascii="Aptos" w:hAnsi="Aptos"/>
-          <w:i/>
           <w:color w:val="6B7280"/>
           <w:sz w:val="15"/>
         </w:rPr>
@@ -1067,6 +1062,7 @@
                 <w:rFonts w:ascii="Aptos" w:hAnsi="Aptos"/>
                 <w:sz w:val="14"/>
               </w:rPr>
+              <w:lastRenderedPageBreak/>
               <w:t>Reasoning scaffolds / self-consistency</w:t>
             </w:r>
           </w:p>
@@ -1363,11 +1359,7 @@
     </w:p>
     <w:p>
       <w:r>
-        <w:t xml:space="preserve">Prompt quality is task-dependent and should be evaluated using more than stylistic preference. Recommended measures include task accuracy or rubric attainment, factual consistency with approved sources, calibration of uncertainty, robustness </w:t>
-      </w:r>
-      <w:r>
-        <w:lastRenderedPageBreak/>
-        <w:t>to paraphrase, completeness, format compliance, latency, token cost and human utility. For coding, executable tests are stronger than prose judgments; for research summarization, citation support and coverage matter; for education, pedagogical correctness and appropriateness for the learner matter.</w:t>
+        <w:t>Prompt quality is task-dependent and should be evaluated using more than stylistic preference. Recommended measures include task accuracy or rubric attainment, factual consistency with approved sources, calibration of uncertainty, robustness to paraphrase, completeness, format compliance, latency, token cost and human utility. For coding, executable tests are stronger than prose judgments; for research summarization, citation support and coverage matter; for education, pedagogical correctness and appropriateness for the learner matter.</w:t>
       </w:r>
     </w:p>
     <w:p>
@@ -1408,6 +1400,7 @@
     </w:p>
     <w:p>
       <w:r>
+        <w:lastRenderedPageBreak/>
         <w:t>Human factors deserve equal attention. Novice users often infer competence from fluent prose and may accept citations, calculations or interpretations without checking them. Training should teach users to identify which claims require external verification and when the model should be asked to expose sources, calculations or structured intermediate artifacts. The goal is calibrated reliance: users should neither trust all outputs nor reject AI assistance categorically.</w:t>
       </w:r>
     </w:p>
@@ -1453,7 +1446,6 @@
         <w:rPr>
           <w:noProof/>
         </w:rPr>
-        <w:lastRenderedPageBreak/>
         <w:drawing>
           <wp:inline distT="0" distB="0" distL="0" distR="0" wp14:anchorId="51D74D0D" wp14:editId="4BB3DB4A">
             <wp:extent cx="5715000" cy="3571875"/>
@@ -1498,12 +1490,22 @@
       </w:pPr>
       <w:r>
         <w:rPr>
-          <w:i/>
           <w:color w:val="5B6573"/>
           <w:sz w:val="16"/>
         </w:rPr>
         <w:t>Figure 2. Reliability-oriented PromptOps lifecycle. Prompt quality is operationalized as a tested workflow linking task specification, grounding, tool governance, verification and post-deployment monitoring. Original author synthesis.</w:t>
       </w:r>
+    </w:p>
+    <w:p>
+      <w:pPr>
+        <w:pStyle w:val="Caption"/>
+        <w:spacing w:before="100" w:after="40"/>
+        <w:rPr>
+          <w:b/>
+          <w:color w:val="102A56"/>
+          <w:sz w:val="17"/>
+        </w:rPr>
+      </w:pPr>
     </w:p>
     <w:p>
       <w:pPr>
@@ -1548,6 +1550,7 @@
                 <w:color w:val="FFFFFF"/>
                 <w:sz w:val="14"/>
               </w:rPr>
+              <w:lastRenderedPageBreak/>
               <w:t>Failure mode</w:t>
             </w:r>
           </w:p>
@@ -2069,9 +2072,18 @@
     <w:p>
       <w:pPr>
         <w:pStyle w:val="References"/>
+        <w:rPr>
+          <w:lang w:val="de-DE"/>
+        </w:rPr>
       </w:pPr>
       <w:r>
-        <w:t>Autio, C., Schwartz, R., Dunietz, J., Jain, S., Stanley, M., Tabassi, E., Hall, P., &amp; Roberts, K. (2024). Artificial Intelligence Risk Management Framework: Generative Artificial Intelligence Profile (NIST AI 600-1). NIST. https://doi.org/10.6028/NIST.AI.600-1</w:t>
+        <w:t xml:space="preserve">Autio, C., Schwartz, R., Dunietz, J., Jain, S., Stanley, M., Tabassi, E., Hall, P., &amp; Roberts, K. (2024). Artificial Intelligence Risk Management Framework: Generative Artificial Intelligence Profile (NIST AI 600-1). </w:t>
+      </w:r>
+      <w:r>
+        <w:rPr>
+          <w:lang w:val="de-DE"/>
+        </w:rPr>
+        <w:t>NIST. https://doi.org/10.6028/NIST.AI.600-1</w:t>
       </w:r>
     </w:p>
     <w:p>
@@ -2079,7 +2091,13 @@
         <w:pStyle w:val="References"/>
       </w:pPr>
       <w:r>
-        <w:t>Lewis, P., Perez, E., Piktus, A., Petroni, F., Karpukhin, V., Goyal, N., Küttler, H., Lewis, M., Yih, W.-t., Rocktäschel, T., Riedel, S., &amp; Kiela, D. (2020). Retrieval-augmented generation for knowledge-intensive NLP tasks. Advances in Neural Information Processing Systems, 33, 9459–9474.</w:t>
+        <w:rPr>
+          <w:lang w:val="de-DE"/>
+        </w:rPr>
+        <w:t xml:space="preserve">Lewis, P., Perez, E., Piktus, A., Petroni, F., Karpukhin, V., Goyal, N., Küttler, H., Lewis, M., Yih, W.-t., Rocktäschel, T., Riedel, S., &amp; Kiela, D. (2020). </w:t>
+      </w:r>
+      <w:r>
+        <w:t>Retrieval-augmented generation for knowledge-intensive NLP tasks. Advances in Neural Information Processing Systems, 33, 9459–9474.</w:t>
       </w:r>
     </w:p>
     <w:p>
@@ -2095,7 +2113,13 @@
         <w:pStyle w:val="References"/>
       </w:pPr>
       <w:r>
-        <w:t>Schulhoff, S., Ilie, M., Balepur, N., Kahadze, K., Liu, A., Si, C., Li, Y., Gupta, A., Han, H., Schulhoff, S., et al. (2024). The Prompt Report: A systematic survey of prompting techniques. arXiv:2406.06608.</w:t>
+        <w:rPr>
+          <w:lang w:val="de-DE"/>
+        </w:rPr>
+        <w:t xml:space="preserve">Schulhoff, S., Ilie, M., Balepur, N., Kahadze, K., Liu, A., Si, C., Li, Y., Gupta, A., Han, H., Schulhoff, S., et al. </w:t>
+      </w:r>
+      <w:r>
+        <w:t>(2024). The Prompt Report: A systematic survey of prompting techniques. arXiv:2406.06608.</w:t>
       </w:r>
     </w:p>
     <w:p>
@@ -2213,27 +2237,78 @@
       <w:spacing w:before="40" w:after="0"/>
       <w:jc w:val="center"/>
     </w:pPr>
-    <w:r/>
     <w:r>
       <w:rPr>
-        <w:rFonts w:ascii="Cambria" w:hAnsi="Cambria" w:eastAsia="Cambria"/>
-        <w:b w:val="0"/>
         <w:color w:val="52616B"/>
         <w:sz w:val="16"/>
       </w:rPr>
-      <w:t xml:space="preserve">© 2026 CHIA TECH SOLUTIONS AND RESOURCES LIMITED  ·  chiatechlibrary@gmail.com  ·  Page </w:t>
+      <w:t xml:space="preserve">© 2026 CHIA TECH SOLUTIONS AND RESOURCES </w:t>
+    </w:r>
+    <w:proofErr w:type="gramStart"/>
+    <w:r>
+      <w:rPr>
+        <w:color w:val="52616B"/>
+        <w:sz w:val="16"/>
+      </w:rPr>
+      <w:t>LIMITED  ·</w:t>
+    </w:r>
+    <w:proofErr w:type="gramEnd"/>
+    <w:r>
+      <w:rPr>
+        <w:color w:val="52616B"/>
+        <w:sz w:val="16"/>
+      </w:rPr>
+      <w:t xml:space="preserve">  </w:t>
+    </w:r>
+    <w:proofErr w:type="gramStart"/>
+    <w:r>
+      <w:rPr>
+        <w:color w:val="52616B"/>
+        <w:sz w:val="16"/>
+      </w:rPr>
+      <w:t>chiatechlibrary@gmail.com  ·</w:t>
+    </w:r>
+    <w:proofErr w:type="gramEnd"/>
+    <w:r>
+      <w:rPr>
+        <w:color w:val="52616B"/>
+        <w:sz w:val="16"/>
+      </w:rPr>
+      <w:t xml:space="preserve">  Page </w:t>
     </w:r>
     <w:r>
       <w:rPr>
-        <w:rFonts w:ascii="Cambria" w:hAnsi="Cambria" w:eastAsia="Cambria"/>
-        <w:b w:val="0"/>
         <w:color w:val="52616B"/>
         <w:sz w:val="16"/>
       </w:rPr>
       <w:fldChar w:fldCharType="begin"/>
+    </w:r>
+    <w:r>
+      <w:rPr>
+        <w:color w:val="52616B"/>
+        <w:sz w:val="16"/>
+      </w:rPr>
       <w:instrText xml:space="preserve"> PAGE </w:instrText>
+    </w:r>
+    <w:r>
+      <w:rPr>
+        <w:color w:val="52616B"/>
+        <w:sz w:val="16"/>
+      </w:rPr>
       <w:fldChar w:fldCharType="separate"/>
+    </w:r>
+    <w:r>
+      <w:rPr>
+        <w:color w:val="52616B"/>
+        <w:sz w:val="16"/>
+      </w:rPr>
       <w:t>1</w:t>
+    </w:r>
+    <w:r>
+      <w:rPr>
+        <w:color w:val="52616B"/>
+        <w:sz w:val="16"/>
+      </w:rPr>
       <w:fldChar w:fldCharType="end"/>
     </w:r>
   </w:p>
@@ -2413,11 +2488,35 @@
   </w:tbl>
   <w:p>
     <w:pPr>
-      <w:spacing w:after="0" w:before="0"/>
+      <w:spacing w:after="0"/>
       <w:jc w:val="center"/>
     </w:pPr>
     <w:r>
-      <w:t>CHIATECH JOURNAL  |  SETEHEM  |  Volume 1, Issue 1 · Pioneer July/August 2026 · Part 2  |  e026</w:t>
+      <w:t xml:space="preserve">CHIATECH </w:t>
+    </w:r>
+    <w:proofErr w:type="gramStart"/>
+    <w:r>
+      <w:t>JOURNAL  |</w:t>
+    </w:r>
+    <w:proofErr w:type="gramEnd"/>
+    <w:r>
+      <w:t xml:space="preserve">  </w:t>
+    </w:r>
+    <w:proofErr w:type="gramStart"/>
+    <w:r>
+      <w:t>SETEHEM  |</w:t>
+    </w:r>
+    <w:proofErr w:type="gramEnd"/>
+    <w:r>
+      <w:t xml:space="preserve">  Volume 1, Issue 1 · Pioneer July/August 2026 · Part </w:t>
+    </w:r>
+    <w:proofErr w:type="gramStart"/>
+    <w:r>
+      <w:t>2  |</w:t>
+    </w:r>
+    <w:proofErr w:type="gramEnd"/>
+    <w:r>
+      <w:t xml:space="preserve">  e026</w:t>
     </w:r>
   </w:p>
 </w:hdr>
@@ -3021,8 +3120,7 @@
       <w:jc w:val="both"/>
     </w:pPr>
     <w:rPr>
-      <w:rFonts w:ascii="Cambria" w:hAnsi="Cambria" w:eastAsia="Cambria"/>
-      <w:b w:val="0"/>
+      <w:rFonts w:ascii="Cambria" w:eastAsia="Cambria" w:hAnsi="Cambria"/>
       <w:color w:val="1E293B"/>
       <w:sz w:val="21"/>
     </w:rPr>
@@ -3038,11 +3136,11 @@
     <w:pPr>
       <w:keepNext/>
       <w:keepLines/>
-      <w:spacing w:before="280" w:after="100"/>
+      <w:spacing w:before="280"/>
       <w:outlineLvl w:val="0"/>
     </w:pPr>
     <w:rPr>
-      <w:rFonts w:asciiTheme="majorHAnsi" w:eastAsiaTheme="majorEastAsia" w:hAnsiTheme="majorHAnsi" w:cstheme="majorBidi" w:ascii="Cambria" w:hAnsi="Cambria" w:eastAsia="Cambria"/>
+      <w:rFonts w:asciiTheme="majorHAnsi" w:eastAsiaTheme="majorEastAsia" w:hAnsiTheme="majorHAnsi" w:cstheme="majorBidi"/>
       <w:b/>
       <w:bCs/>
       <w:color w:val="0B3D5C"/>
@@ -3066,7 +3164,7 @@
       <w:outlineLvl w:val="1"/>
     </w:pPr>
     <w:rPr>
-      <w:rFonts w:asciiTheme="majorHAnsi" w:eastAsiaTheme="majorEastAsia" w:hAnsiTheme="majorHAnsi" w:cstheme="majorBidi" w:ascii="Cambria" w:hAnsi="Cambria" w:eastAsia="Cambria"/>
+      <w:rFonts w:asciiTheme="majorHAnsi" w:eastAsiaTheme="majorEastAsia" w:hAnsiTheme="majorHAnsi" w:cstheme="majorBidi"/>
       <w:b/>
       <w:bCs/>
       <w:color w:val="0B3D5C"/>
@@ -3090,11 +3188,10 @@
       <w:outlineLvl w:val="2"/>
     </w:pPr>
     <w:rPr>
-      <w:rFonts w:asciiTheme="majorHAnsi" w:eastAsiaTheme="majorEastAsia" w:hAnsiTheme="majorHAnsi" w:cstheme="majorBidi" w:ascii="Cambria" w:hAnsi="Cambria" w:eastAsia="Cambria"/>
+      <w:rFonts w:asciiTheme="majorHAnsi" w:eastAsiaTheme="majorEastAsia" w:hAnsiTheme="majorHAnsi" w:cstheme="majorBidi"/>
       <w:b/>
       <w:bCs/>
       <w:color w:val="0B3D5C"/>
-      <w:sz w:val="21"/>
     </w:rPr>
   </w:style>
   <w:style w:type="paragraph" w:styleId="Heading4">
@@ -3377,7 +3474,7 @@
       <w:contextualSpacing/>
     </w:pPr>
     <w:rPr>
-      <w:rFonts w:asciiTheme="majorHAnsi" w:eastAsiaTheme="majorEastAsia" w:hAnsiTheme="majorHAnsi" w:cstheme="majorBidi" w:ascii="Cambria" w:hAnsi="Cambria" w:eastAsia="Cambria"/>
+      <w:rFonts w:asciiTheme="majorHAnsi" w:eastAsiaTheme="majorEastAsia" w:hAnsiTheme="majorHAnsi" w:cstheme="majorBidi"/>
       <w:b/>
       <w:color w:val="0B3D5C"/>
       <w:spacing w:val="5"/>
@@ -3415,8 +3512,7 @@
       </w:numPr>
     </w:pPr>
     <w:rPr>
-      <w:rFonts w:asciiTheme="majorHAnsi" w:eastAsiaTheme="majorEastAsia" w:hAnsiTheme="majorHAnsi" w:cstheme="majorBidi" w:ascii="Cambria" w:hAnsi="Cambria" w:eastAsia="Cambria"/>
-      <w:b w:val="0"/>
+      <w:rFonts w:asciiTheme="majorHAnsi" w:eastAsiaTheme="majorEastAsia" w:hAnsiTheme="majorHAnsi" w:cstheme="majorBidi"/>
       <w:i/>
       <w:iCs/>
       <w:color w:val="52616B"/>
@@ -3818,12 +3914,10 @@
     <w:qFormat/>
     <w:rsid w:val="00FC693F"/>
     <w:pPr>
-      <w:spacing w:after="120" w:before="60"/>
+      <w:spacing w:before="60" w:after="120"/>
       <w:jc w:val="center"/>
     </w:pPr>
     <w:rPr>
-      <w:rFonts w:ascii="Cambria" w:hAnsi="Cambria" w:eastAsia="Cambria"/>
-      <w:b w:val="0"/>
       <w:bCs/>
       <w:i/>
       <w:color w:val="334155"/>

</xml_diff>